<commit_message>
fix(templates): drop three item rows so the material request signature stays on page one
</commit_message>
<xml_diff>
--- a/backend/templates/GSSG-NAT_300-004_Material_Request_Form_AR.docx
+++ b/backend/templates/GSSG-NAT_300-004_Material_Request_Form_AR.docx
@@ -3061,513 +3061,6 @@
                 <w:rtl/>
               </w:rPr>
               <w:t>{{ item(16, 'remarks', '') }}</w:t>
-            </w:r>
-          </w:p>
-        </w:tc>
-      </w:tr>
-      <w:tr>
-        <w:trPr>
-          <w:jc w:val="center"/>
-        </w:trPr>
-        <w:tc>
-          <w:tcPr>
-            <w:tcW w:w="749" w:type="dxa"/>
-            <w:vAlign w:val="center"/>
-          </w:tcPr>
-          <w:p>
-            <w:pPr>
-              <w:bidi/>
-              <w:jc w:val="center"/>
-              <w:rPr>
-                <w:rFonts w:ascii="Univers Next Arabic" w:hAnsi="Univers Next Arabic" w:cs="Univers Next Arabic"/>
-                <w:color w:val="000000"/>
-                <w:sz w:val="19"/>
-                <w:szCs w:val="19"/>
-                <w:rtl/>
-              </w:rPr>
-            </w:pPr>
-            <w:r>
-              <w:rPr>
-                <w:rFonts w:ascii="Univers Next Arabic" w:hAnsi="Univers Next Arabic" w:cs="Univers Next Arabic"/>
-                <w:sz w:val="19"/>
-                <w:szCs w:val="19"/>
-                <w:lang w:val="en-AE"/>
-                <w:rtl w:val="0"/>
-              </w:rPr>
-              <w:t>{{ item(17, 'sno', '') }}</w:t>
-            </w:r>
-          </w:p>
-        </w:tc>
-        <w:tc>
-          <w:tcPr>
-            <w:tcW w:w="1195" w:type="dxa"/>
-            <w:vAlign w:val="center"/>
-          </w:tcPr>
-          <w:p>
-            <w:pPr>
-              <w:bidi/>
-              <w:jc w:val="center"/>
-              <w:rPr>
-                <w:rFonts w:ascii="Univers Next Arabic" w:hAnsi="Univers Next Arabic" w:cs="Univers Next Arabic"/>
-                <w:sz w:val="19"/>
-                <w:szCs w:val="19"/>
-              </w:rPr>
-            </w:pPr>
-            <w:r>
-              <w:rPr>
-                <w:rFonts w:ascii="Univers Next Arabic" w:hAnsi="Univers Next Arabic" w:cs="Univers Next Arabic"/>
-                <w:sz w:val="19"/>
-                <w:szCs w:val="19"/>
-                <w:lang w:val="en-AE"/>
-                <w:rtl w:val="0"/>
-              </w:rPr>
-              <w:t>{{ item(17, 'code', '') }}</w:t>
-            </w:r>
-          </w:p>
-        </w:tc>
-        <w:tc>
-          <w:tcPr>
-            <w:tcW w:w="4320" w:type="dxa"/>
-            <w:vAlign w:val="center"/>
-          </w:tcPr>
-          <w:p>
-            <w:pPr>
-              <w:bidi/>
-              <w:jc w:val="center"/>
-              <w:rPr>
-                <w:rFonts w:ascii="Univers Next Arabic" w:hAnsi="Univers Next Arabic" w:cs="Univers Next Arabic"/>
-                <w:sz w:val="19"/>
-                <w:szCs w:val="19"/>
-              </w:rPr>
-            </w:pPr>
-            <w:r>
-              <w:rPr>
-                <w:rFonts w:ascii="Univers Next Arabic" w:hAnsi="Univers Next Arabic" w:cs="Univers Next Arabic"/>
-                <w:sz w:val="19"/>
-                <w:szCs w:val="19"/>
-                <w:lang w:val="en-AE"/>
-                <w:rtl/>
-              </w:rPr>
-              <w:t>{{ item(17, 'description', '') }}</w:t>
-            </w:r>
-          </w:p>
-        </w:tc>
-        <w:tc>
-          <w:tcPr>
-            <w:tcW w:w="979" w:type="dxa"/>
-            <w:vAlign w:val="center"/>
-          </w:tcPr>
-          <w:p>
-            <w:pPr>
-              <w:bidi/>
-              <w:jc w:val="center"/>
-              <w:rPr>
-                <w:rFonts w:ascii="Univers Next Arabic" w:hAnsi="Univers Next Arabic" w:cs="Univers Next Arabic"/>
-                <w:sz w:val="19"/>
-                <w:szCs w:val="19"/>
-              </w:rPr>
-            </w:pPr>
-            <w:r>
-              <w:rPr>
-                <w:rFonts w:ascii="Univers Next Arabic" w:hAnsi="Univers Next Arabic" w:cs="Univers Next Arabic"/>
-                <w:sz w:val="19"/>
-                <w:szCs w:val="19"/>
-                <w:lang w:val="en-AE"/>
-                <w:rtl/>
-              </w:rPr>
-              <w:t>{{ item(17, 'unit', '') }}</w:t>
-            </w:r>
-          </w:p>
-        </w:tc>
-        <w:tc>
-          <w:tcPr>
-            <w:tcW w:w="936" w:type="dxa"/>
-            <w:vAlign w:val="center"/>
-          </w:tcPr>
-          <w:p>
-            <w:pPr>
-              <w:bidi/>
-              <w:jc w:val="center"/>
-              <w:rPr>
-                <w:rFonts w:ascii="Univers Next Arabic" w:hAnsi="Univers Next Arabic" w:cs="Univers Next Arabic"/>
-                <w:sz w:val="19"/>
-                <w:szCs w:val="19"/>
-              </w:rPr>
-            </w:pPr>
-            <w:r>
-              <w:rPr>
-                <w:rFonts w:ascii="Univers Next Arabic" w:hAnsi="Univers Next Arabic" w:cs="Univers Next Arabic"/>
-                <w:sz w:val="19"/>
-                <w:szCs w:val="19"/>
-                <w:lang w:val="en-AE"/>
-                <w:rtl w:val="0"/>
-              </w:rPr>
-              <w:t>{{ item(17, 'qty', '') }}</w:t>
-            </w:r>
-          </w:p>
-        </w:tc>
-        <w:tc>
-          <w:tcPr>
-            <w:tcW w:w="2592" w:type="dxa"/>
-            <w:vAlign w:val="center"/>
-          </w:tcPr>
-          <w:p>
-            <w:pPr>
-              <w:bidi/>
-              <w:jc w:val="center"/>
-              <w:rPr>
-                <w:rFonts w:ascii="Univers Next Arabic" w:hAnsi="Univers Next Arabic" w:cs="Univers Next Arabic"/>
-                <w:sz w:val="19"/>
-                <w:szCs w:val="19"/>
-              </w:rPr>
-            </w:pPr>
-            <w:r>
-              <w:rPr>
-                <w:rFonts w:ascii="Univers Next Arabic" w:hAnsi="Univers Next Arabic" w:cs="Univers Next Arabic"/>
-                <w:sz w:val="19"/>
-                <w:szCs w:val="19"/>
-                <w:lang w:val="en-AE"/>
-                <w:rtl/>
-              </w:rPr>
-              <w:t>{{ item(17, 'remarks', '') }}</w:t>
-            </w:r>
-          </w:p>
-        </w:tc>
-      </w:tr>
-      <w:tr>
-        <w:trPr>
-          <w:jc w:val="center"/>
-        </w:trPr>
-        <w:tc>
-          <w:tcPr>
-            <w:tcW w:w="749" w:type="dxa"/>
-            <w:vAlign w:val="center"/>
-          </w:tcPr>
-          <w:p>
-            <w:pPr>
-              <w:bidi/>
-              <w:jc w:val="center"/>
-              <w:rPr>
-                <w:rFonts w:ascii="Univers Next Arabic" w:hAnsi="Univers Next Arabic" w:cs="Univers Next Arabic" w:hint="cs"/>
-                <w:color w:val="000000"/>
-                <w:sz w:val="19"/>
-                <w:szCs w:val="19"/>
-                <w:rtl/>
-              </w:rPr>
-            </w:pPr>
-            <w:r>
-              <w:rPr>
-                <w:rFonts w:ascii="Univers Next Arabic" w:hAnsi="Univers Next Arabic" w:cs="Univers Next Arabic"/>
-                <w:sz w:val="19"/>
-                <w:szCs w:val="19"/>
-                <w:lang w:val="en-AE"/>
-                <w:rtl w:val="0"/>
-              </w:rPr>
-              <w:t>{{ item(18, 'sno', '') }}</w:t>
-            </w:r>
-          </w:p>
-        </w:tc>
-        <w:tc>
-          <w:tcPr>
-            <w:tcW w:w="1195" w:type="dxa"/>
-            <w:vAlign w:val="center"/>
-          </w:tcPr>
-          <w:p>
-            <w:pPr>
-              <w:bidi/>
-              <w:jc w:val="center"/>
-              <w:rPr>
-                <w:rFonts w:ascii="Univers Next Arabic" w:hAnsi="Univers Next Arabic" w:cs="Univers Next Arabic"/>
-                <w:sz w:val="19"/>
-                <w:szCs w:val="19"/>
-              </w:rPr>
-            </w:pPr>
-            <w:r>
-              <w:rPr>
-                <w:rFonts w:ascii="Univers Next Arabic" w:hAnsi="Univers Next Arabic" w:cs="Univers Next Arabic"/>
-                <w:sz w:val="19"/>
-                <w:szCs w:val="19"/>
-                <w:lang w:val="en-AE"/>
-                <w:rtl w:val="0"/>
-              </w:rPr>
-              <w:t>{{ item(18, 'code', '') }}</w:t>
-            </w:r>
-          </w:p>
-        </w:tc>
-        <w:tc>
-          <w:tcPr>
-            <w:tcW w:w="4320" w:type="dxa"/>
-            <w:vAlign w:val="center"/>
-          </w:tcPr>
-          <w:p>
-            <w:pPr>
-              <w:bidi/>
-              <w:jc w:val="center"/>
-              <w:rPr>
-                <w:rFonts w:ascii="Univers Next Arabic" w:hAnsi="Univers Next Arabic" w:cs="Univers Next Arabic"/>
-                <w:sz w:val="19"/>
-                <w:szCs w:val="19"/>
-              </w:rPr>
-            </w:pPr>
-            <w:r>
-              <w:rPr>
-                <w:rFonts w:ascii="Univers Next Arabic" w:hAnsi="Univers Next Arabic" w:cs="Univers Next Arabic"/>
-                <w:sz w:val="19"/>
-                <w:szCs w:val="19"/>
-                <w:lang w:val="en-AE"/>
-                <w:rtl/>
-              </w:rPr>
-              <w:t>{{ item(18, 'description', '') }}</w:t>
-            </w:r>
-          </w:p>
-        </w:tc>
-        <w:tc>
-          <w:tcPr>
-            <w:tcW w:w="979" w:type="dxa"/>
-            <w:vAlign w:val="center"/>
-          </w:tcPr>
-          <w:p>
-            <w:pPr>
-              <w:bidi/>
-              <w:jc w:val="center"/>
-              <w:rPr>
-                <w:rFonts w:ascii="Univers Next Arabic" w:hAnsi="Univers Next Arabic" w:cs="Univers Next Arabic"/>
-                <w:sz w:val="19"/>
-                <w:szCs w:val="19"/>
-              </w:rPr>
-            </w:pPr>
-            <w:r>
-              <w:rPr>
-                <w:rFonts w:ascii="Univers Next Arabic" w:hAnsi="Univers Next Arabic" w:cs="Univers Next Arabic"/>
-                <w:sz w:val="19"/>
-                <w:szCs w:val="19"/>
-                <w:lang w:val="en-AE"/>
-                <w:rtl/>
-              </w:rPr>
-              <w:t>{{ item(18, 'unit', '') }}</w:t>
-            </w:r>
-          </w:p>
-        </w:tc>
-        <w:tc>
-          <w:tcPr>
-            <w:tcW w:w="936" w:type="dxa"/>
-            <w:vAlign w:val="center"/>
-          </w:tcPr>
-          <w:p>
-            <w:pPr>
-              <w:bidi/>
-              <w:jc w:val="center"/>
-              <w:rPr>
-                <w:rFonts w:ascii="Univers Next Arabic" w:hAnsi="Univers Next Arabic" w:cs="Univers Next Arabic"/>
-                <w:sz w:val="19"/>
-                <w:szCs w:val="19"/>
-              </w:rPr>
-            </w:pPr>
-            <w:r>
-              <w:rPr>
-                <w:rFonts w:ascii="Univers Next Arabic" w:hAnsi="Univers Next Arabic" w:cs="Univers Next Arabic"/>
-                <w:sz w:val="19"/>
-                <w:szCs w:val="19"/>
-                <w:lang w:val="en-AE"/>
-                <w:rtl w:val="0"/>
-              </w:rPr>
-              <w:t>{{ item(18, 'qty', '') }}</w:t>
-            </w:r>
-          </w:p>
-        </w:tc>
-        <w:tc>
-          <w:tcPr>
-            <w:tcW w:w="2592" w:type="dxa"/>
-            <w:vAlign w:val="center"/>
-          </w:tcPr>
-          <w:p>
-            <w:pPr>
-              <w:bidi/>
-              <w:jc w:val="center"/>
-              <w:rPr>
-                <w:rFonts w:ascii="Univers Next Arabic" w:hAnsi="Univers Next Arabic" w:cs="Univers Next Arabic"/>
-                <w:sz w:val="19"/>
-                <w:szCs w:val="19"/>
-              </w:rPr>
-            </w:pPr>
-            <w:r>
-              <w:rPr>
-                <w:rFonts w:ascii="Univers Next Arabic" w:hAnsi="Univers Next Arabic" w:cs="Univers Next Arabic"/>
-                <w:sz w:val="19"/>
-                <w:szCs w:val="19"/>
-                <w:lang w:val="en-AE"/>
-                <w:rtl/>
-              </w:rPr>
-              <w:t>{{ item(18, 'remarks', '') }}</w:t>
-            </w:r>
-          </w:p>
-        </w:tc>
-      </w:tr>
-      <w:tr>
-        <w:trPr>
-          <w:jc w:val="center"/>
-        </w:trPr>
-        <w:tc>
-          <w:tcPr>
-            <w:tcW w:w="749" w:type="dxa"/>
-            <w:vAlign w:val="center"/>
-          </w:tcPr>
-          <w:p>
-            <w:pPr>
-              <w:bidi/>
-              <w:jc w:val="center"/>
-              <w:rPr>
-                <w:rFonts w:ascii="Univers Next Arabic" w:hAnsi="Univers Next Arabic" w:cs="Univers Next Arabic" w:hint="cs"/>
-                <w:color w:val="000000"/>
-                <w:sz w:val="19"/>
-                <w:szCs w:val="19"/>
-                <w:rtl/>
-              </w:rPr>
-            </w:pPr>
-            <w:r>
-              <w:rPr>
-                <w:rFonts w:ascii="Univers Next Arabic" w:hAnsi="Univers Next Arabic" w:cs="Univers Next Arabic"/>
-                <w:sz w:val="19"/>
-                <w:szCs w:val="19"/>
-                <w:lang w:val="en-AE"/>
-                <w:rtl w:val="0"/>
-              </w:rPr>
-              <w:t>{{ item(19, 'sno', '') }}</w:t>
-            </w:r>
-          </w:p>
-        </w:tc>
-        <w:tc>
-          <w:tcPr>
-            <w:tcW w:w="1195" w:type="dxa"/>
-            <w:vAlign w:val="center"/>
-          </w:tcPr>
-          <w:p>
-            <w:pPr>
-              <w:bidi/>
-              <w:jc w:val="center"/>
-              <w:rPr>
-                <w:rFonts w:ascii="Univers Next Arabic" w:hAnsi="Univers Next Arabic" w:cs="Univers Next Arabic"/>
-                <w:sz w:val="19"/>
-                <w:szCs w:val="19"/>
-              </w:rPr>
-            </w:pPr>
-            <w:r>
-              <w:rPr>
-                <w:rFonts w:ascii="Univers Next Arabic" w:hAnsi="Univers Next Arabic" w:cs="Univers Next Arabic"/>
-                <w:sz w:val="19"/>
-                <w:szCs w:val="19"/>
-                <w:lang w:val="en-AE"/>
-                <w:rtl w:val="0"/>
-              </w:rPr>
-              <w:t>{{ item(19, 'code', '') }}</w:t>
-            </w:r>
-          </w:p>
-        </w:tc>
-        <w:tc>
-          <w:tcPr>
-            <w:tcW w:w="4320" w:type="dxa"/>
-            <w:vAlign w:val="center"/>
-          </w:tcPr>
-          <w:p>
-            <w:pPr>
-              <w:bidi/>
-              <w:jc w:val="center"/>
-              <w:rPr>
-                <w:rFonts w:ascii="Univers Next Arabic" w:hAnsi="Univers Next Arabic" w:cs="Univers Next Arabic"/>
-                <w:sz w:val="19"/>
-                <w:szCs w:val="19"/>
-              </w:rPr>
-            </w:pPr>
-            <w:r>
-              <w:rPr>
-                <w:rFonts w:ascii="Univers Next Arabic" w:hAnsi="Univers Next Arabic" w:cs="Univers Next Arabic"/>
-                <w:sz w:val="19"/>
-                <w:szCs w:val="19"/>
-                <w:lang w:val="en-AE"/>
-                <w:rtl/>
-              </w:rPr>
-              <w:t>{{ item(19, 'description', '') }}</w:t>
-            </w:r>
-          </w:p>
-        </w:tc>
-        <w:tc>
-          <w:tcPr>
-            <w:tcW w:w="979" w:type="dxa"/>
-            <w:vAlign w:val="center"/>
-          </w:tcPr>
-          <w:p>
-            <w:pPr>
-              <w:bidi/>
-              <w:jc w:val="center"/>
-              <w:rPr>
-                <w:rFonts w:ascii="Univers Next Arabic" w:hAnsi="Univers Next Arabic" w:cs="Univers Next Arabic"/>
-                <w:sz w:val="19"/>
-                <w:szCs w:val="19"/>
-              </w:rPr>
-            </w:pPr>
-            <w:r>
-              <w:rPr>
-                <w:rFonts w:ascii="Univers Next Arabic" w:hAnsi="Univers Next Arabic" w:cs="Univers Next Arabic"/>
-                <w:sz w:val="19"/>
-                <w:szCs w:val="19"/>
-                <w:lang w:val="en-AE"/>
-                <w:rtl/>
-              </w:rPr>
-              <w:t>{{ item(19, 'unit', '') }}</w:t>
-            </w:r>
-          </w:p>
-        </w:tc>
-        <w:tc>
-          <w:tcPr>
-            <w:tcW w:w="936" w:type="dxa"/>
-            <w:vAlign w:val="center"/>
-          </w:tcPr>
-          <w:p>
-            <w:pPr>
-              <w:bidi/>
-              <w:jc w:val="center"/>
-              <w:rPr>
-                <w:rFonts w:ascii="Univers Next Arabic" w:hAnsi="Univers Next Arabic" w:cs="Univers Next Arabic"/>
-                <w:sz w:val="19"/>
-                <w:szCs w:val="19"/>
-              </w:rPr>
-            </w:pPr>
-            <w:r>
-              <w:rPr>
-                <w:rFonts w:ascii="Univers Next Arabic" w:hAnsi="Univers Next Arabic" w:cs="Univers Next Arabic"/>
-                <w:sz w:val="19"/>
-                <w:szCs w:val="19"/>
-                <w:lang w:val="en-AE"/>
-                <w:rtl w:val="0"/>
-              </w:rPr>
-              <w:t>{{ item(19, 'qty', '') }}</w:t>
-            </w:r>
-          </w:p>
-        </w:tc>
-        <w:tc>
-          <w:tcPr>
-            <w:tcW w:w="2592" w:type="dxa"/>
-            <w:vAlign w:val="center"/>
-          </w:tcPr>
-          <w:p>
-            <w:pPr>
-              <w:bidi/>
-              <w:jc w:val="center"/>
-              <w:rPr>
-                <w:rFonts w:ascii="Univers Next Arabic" w:hAnsi="Univers Next Arabic" w:cs="Univers Next Arabic"/>
-                <w:sz w:val="19"/>
-                <w:szCs w:val="19"/>
-              </w:rPr>
-            </w:pPr>
-            <w:r>
-              <w:rPr>
-                <w:rFonts w:ascii="Univers Next Arabic" w:hAnsi="Univers Next Arabic" w:cs="Univers Next Arabic"/>
-                <w:sz w:val="19"/>
-                <w:szCs w:val="19"/>
-                <w:lang w:val="en-AE"/>
-                <w:rtl/>
-              </w:rPr>
-              <w:t>{{ item(19, 'remarks', '') }}</w:t>
             </w:r>
           </w:p>
         </w:tc>

</xml_diff>

<commit_message>
fix(templates): add the security general manager to the Arabic material request final approval
Two approvers side by side under the final approval heading, on a symmetric
grid (label 1506 | value 3596 | gap 567 | label 1506 | value 3596) at the
10771 width of the tables above, so the gap and both edges line up.
</commit_message>
<xml_diff>
--- a/backend/templates/GSSG-NAT_300-004_Material_Request_Form_AR.docx
+++ b/backend/templates/GSSG-NAT_300-004_Material_Request_Form_AR.docx
@@ -3409,10 +3409,11 @@
         <w:tblLook w:val="04A0" w:firstRow="1" w:lastRow="0" w:firstColumn="1" w:lastColumn="0" w:noHBand="0" w:noVBand="1"/>
       </w:tblPr>
       <w:tblGrid>
-        <w:gridCol w:w="1800"/>
-        <w:gridCol w:w="4722"/>
-        <w:gridCol w:w="1418"/>
-        <w:gridCol w:w="2831"/>
+        <w:gridCol w:w="1506"/>
+        <w:gridCol w:w="3596"/>
+        <w:gridCol w:w="567"/>
+        <w:gridCol w:w="1506"/>
+        <w:gridCol w:w="3596"/>
       </w:tblGrid>
       <w:tr>
         <w:trPr>
@@ -3421,7 +3422,7 @@
         <w:tc>
           <w:tcPr>
             <w:tcW w:w="10771" w:type="dxa"/>
-            <w:gridSpan w:val="4"/>
+            <w:gridSpan w:val="5"/>
             <w:tcBorders>
               <w:top w:val="single" w:sz="6" w:space="0" w:color="000000" w:themeColor="text1"/>
               <w:left w:val="single" w:sz="6" w:space="0" w:color="000000" w:themeColor="text1"/>
@@ -3429,7 +3430,6 @@
               <w:right w:val="single" w:sz="6" w:space="0" w:color="000000" w:themeColor="text1"/>
             </w:tcBorders>
             <w:shd w:val="clear" w:color="auto" w:fill="C90000"/>
-            <w:vAlign w:val="center"/>
           </w:tcPr>
           <w:p>
             <w:pPr>
@@ -3464,12 +3464,70 @@
         </w:trPr>
         <w:tc>
           <w:tcPr>
-            <w:tcW w:w="10771" w:type="dxa"/>
-            <w:gridSpan w:val="4"/>
+            <w:tcW w:w="5102" w:type="dxa"/>
+            <w:gridSpan w:val="2"/>
             <w:tcBorders>
               <w:top w:val="single" w:sz="6" w:space="0" w:color="FFFFFF" w:themeColor="background1"/>
               <w:left w:val="single" w:sz="6" w:space="0" w:color="000000" w:themeColor="text1"/>
-              <w:bottom w:val="single" w:sz="6" w:space="0" w:color="FFFFFF" w:themeColor="background1"/>
+              <w:bottom w:val="single" w:sz="4" w:space="0" w:color="auto"/>
+              <w:right w:val="single" w:sz="4" w:space="0" w:color="auto"/>
+            </w:tcBorders>
+            <w:shd w:val="clear" w:color="auto" w:fill="C90000"/>
+            <w:vAlign w:val="center"/>
+          </w:tcPr>
+          <w:p>
+            <w:pPr>
+              <w:bidi/>
+              <w:jc w:val="center"/>
+              <w:rPr>
+                <w:rFonts w:ascii="Univers Next Arabic" w:hAnsi="Univers Next Arabic" w:cs="Univers Next Arabic"/>
+                <w:sz w:val="19"/>
+                <w:szCs w:val="19"/>
+              </w:rPr>
+            </w:pPr>
+            <w:r>
+              <w:rPr>
+                <w:rFonts w:ascii="Univers Next Arabic" w:hAnsi="Univers Next Arabic" w:cs="Univers Next Arabic"/>
+                <w:b/>
+                <w:color w:val="FFFFFF"/>
+                <w:sz w:val="19"/>
+                <w:szCs w:val="19"/>
+                <w:rtl/>
+              </w:rPr>
+              <w:t>المدير التنفيذي لمراكز الإصلاح والتأهيل</w:t>
+            </w:r>
+          </w:p>
+        </w:tc>
+        <w:tc>
+          <w:tcPr>
+            <w:tcW w:w="567" w:type="dxa"/>
+            <w:tcBorders>
+              <w:top w:val="nil"/>
+              <w:left w:val="single" w:sz="4" w:space="0" w:color="auto"/>
+              <w:bottom w:val="nil"/>
+              <w:right w:val="single" w:sz="4" w:space="0" w:color="auto"/>
+            </w:tcBorders>
+          </w:tcPr>
+          <w:p>
+            <w:pPr>
+              <w:bidi/>
+              <w:jc w:val="center"/>
+              <w:rPr>
+                <w:rFonts w:ascii="Univers Next Arabic" w:hAnsi="Univers Next Arabic" w:cs="Univers Next Arabic"/>
+                <w:sz w:val="19"/>
+                <w:szCs w:val="19"/>
+              </w:rPr>
+            </w:pPr>
+          </w:p>
+        </w:tc>
+        <w:tc>
+          <w:tcPr>
+            <w:tcW w:w="5102" w:type="dxa"/>
+            <w:gridSpan w:val="2"/>
+            <w:tcBorders>
+              <w:top w:val="single" w:sz="6" w:space="0" w:color="FFFFFF" w:themeColor="background1"/>
+              <w:left w:val="single" w:sz="4" w:space="0" w:color="auto"/>
+              <w:bottom w:val="single" w:sz="4" w:space="0" w:color="auto"/>
               <w:right w:val="single" w:sz="6" w:space="0" w:color="000000" w:themeColor="text1"/>
             </w:tcBorders>
             <w:shd w:val="clear" w:color="auto" w:fill="C90000"/>
@@ -3480,21 +3538,23 @@
               <w:bidi/>
               <w:jc w:val="center"/>
               <w:rPr>
-                <w:rFonts w:ascii="Univers Next Arabic" w:hAnsi="Univers Next Arabic" w:cs="Univers Next Arabic"/>
-                <w:sz w:val="19"/>
-                <w:szCs w:val="19"/>
-              </w:rPr>
-            </w:pPr>
-            <w:r>
-              <w:rPr>
-                <w:rFonts w:ascii="Univers Next Arabic" w:hAnsi="Univers Next Arabic" w:cs="Univers Next Arabic"/>
-                <w:b/>
-                <w:color w:val="FFFFFF"/>
+                <w:rFonts w:ascii="Univers Next Arabic" w:hAnsi="Univers Next Arabic" w:cs="Univers Next Arabic" w:hint="cs"/>
                 <w:sz w:val="19"/>
                 <w:szCs w:val="19"/>
                 <w:rtl/>
-              </w:rPr>
-              <w:t>المدير التنفيذي لمراكز الإصلاح والتأهيل</w:t>
+                <w:lang w:val="en-AE" w:bidi="ar-AE"/>
+              </w:rPr>
+            </w:pPr>
+            <w:r>
+              <w:rPr>
+                <w:rFonts w:ascii="Univers Next Arabic" w:hAnsi="Univers Next Arabic" w:cs="Univers Next Arabic" w:hint="cs"/>
+                <w:color w:val="FFFFFF" w:themeColor="background1"/>
+                <w:sz w:val="19"/>
+                <w:szCs w:val="19"/>
+                <w:rtl/>
+                <w:lang w:val="en-AE" w:bidi="ar-AE"/>
+              </w:rPr>
+              <w:t xml:space="preserve">المدير العام للحراسات الأمنية </w:t>
             </w:r>
           </w:p>
         </w:tc>
@@ -3506,9 +3566,11 @@
         </w:trPr>
         <w:tc>
           <w:tcPr>
-            <w:tcW w:w="1800" w:type="dxa"/>
+            <w:tcW w:w="1506" w:type="dxa"/>
             <w:tcBorders>
-              <w:top w:val="single" w:sz="6" w:space="0" w:color="000000" w:themeColor="text1"/>
+              <w:top w:val="single" w:sz="4" w:space="0" w:color="auto"/>
+              <w:bottom w:val="single" w:sz="4" w:space="0" w:color="auto"/>
+              <w:right w:val="single" w:sz="6" w:space="0" w:color="222222"/>
             </w:tcBorders>
             <w:shd w:val="clear" w:color="auto" w:fill="D9D9D9"/>
             <w:vAlign w:val="center"/>
@@ -3531,6 +3593,7 @@
                 <w:szCs w:val="19"/>
                 <w:rtl/>
               </w:rPr>
+              <w:lastRenderedPageBreak/>
               <w:t>ا</w:t>
             </w:r>
             <w:r>
@@ -3548,9 +3611,12 @@
         </w:tc>
         <w:tc>
           <w:tcPr>
-            <w:tcW w:w="4722" w:type="dxa"/>
+            <w:tcW w:w="3596" w:type="dxa"/>
             <w:tcBorders>
-              <w:top w:val="single" w:sz="6" w:space="0" w:color="000000" w:themeColor="text1"/>
+              <w:top w:val="single" w:sz="4" w:space="0" w:color="auto"/>
+              <w:left w:val="single" w:sz="6" w:space="0" w:color="222222"/>
+              <w:bottom w:val="single" w:sz="4" w:space="0" w:color="auto"/>
+              <w:right w:val="single" w:sz="4" w:space="0" w:color="auto"/>
             </w:tcBorders>
             <w:vAlign w:val="center"/>
           </w:tcPr>
@@ -3568,9 +3634,37 @@
         </w:tc>
         <w:tc>
           <w:tcPr>
-            <w:tcW w:w="1418" w:type="dxa"/>
+            <w:tcW w:w="567" w:type="dxa"/>
             <w:tcBorders>
-              <w:top w:val="single" w:sz="6" w:space="0" w:color="000000" w:themeColor="text1"/>
+              <w:top w:val="nil"/>
+              <w:left w:val="single" w:sz="4" w:space="0" w:color="auto"/>
+              <w:bottom w:val="nil"/>
+              <w:right w:val="single" w:sz="4" w:space="0" w:color="auto"/>
+            </w:tcBorders>
+          </w:tcPr>
+          <w:p>
+            <w:pPr>
+              <w:bidi/>
+              <w:jc w:val="center"/>
+              <w:rPr>
+                <w:rFonts w:ascii="Univers Next Arabic" w:hAnsi="Univers Next Arabic" w:cs="Univers Next Arabic"/>
+                <w:b/>
+                <w:color w:val="000000"/>
+                <w:sz w:val="19"/>
+                <w:szCs w:val="19"/>
+                <w:rtl/>
+              </w:rPr>
+            </w:pPr>
+          </w:p>
+        </w:tc>
+        <w:tc>
+          <w:tcPr>
+            <w:tcW w:w="1506" w:type="dxa"/>
+            <w:tcBorders>
+              <w:top w:val="single" w:sz="4" w:space="0" w:color="auto"/>
+              <w:left w:val="single" w:sz="4" w:space="0" w:color="auto"/>
+              <w:bottom w:val="single" w:sz="4" w:space="0" w:color="auto"/>
+              <w:right w:val="single" w:sz="6" w:space="0" w:color="222222"/>
             </w:tcBorders>
             <w:shd w:val="clear" w:color="auto" w:fill="D9D9D9"/>
             <w:vAlign w:val="center"/>
@@ -3594,15 +3688,176 @@
                 <w:szCs w:val="19"/>
                 <w:rtl/>
               </w:rPr>
+              <w:t>ا</w:t>
+            </w:r>
+            <w:r>
+              <w:rPr>
+                <w:rFonts w:ascii="Univers Next Arabic" w:hAnsi="Univers Next Arabic" w:cs="Univers Next Arabic" w:hint="cs"/>
+                <w:b/>
+                <w:color w:val="000000"/>
+                <w:sz w:val="19"/>
+                <w:szCs w:val="19"/>
+                <w:rtl/>
+              </w:rPr>
+              <w:t>لاسم</w:t>
+            </w:r>
+          </w:p>
+        </w:tc>
+        <w:tc>
+          <w:tcPr>
+            <w:tcW w:w="3596" w:type="dxa"/>
+            <w:tcBorders>
+              <w:top w:val="single" w:sz="4" w:space="0" w:color="auto"/>
+              <w:left w:val="single" w:sz="6" w:space="0" w:color="222222"/>
+              <w:bottom w:val="single" w:sz="4" w:space="0" w:color="auto"/>
+            </w:tcBorders>
+            <w:vAlign w:val="center"/>
+          </w:tcPr>
+          <w:p>
+            <w:pPr>
+              <w:bidi/>
+              <w:jc w:val="right"/>
+              <w:rPr>
+                <w:rFonts w:ascii="Univers Next Arabic" w:hAnsi="Univers Next Arabic" w:cs="Univers Next Arabic"/>
+                <w:sz w:val="19"/>
+                <w:szCs w:val="19"/>
+              </w:rPr>
+            </w:pPr>
+          </w:p>
+        </w:tc>
+      </w:tr>
+      <w:tr>
+        <w:trPr>
+          <w:trHeight w:val="467"/>
+          <w:jc w:val="center"/>
+        </w:trPr>
+        <w:tc>
+          <w:tcPr>
+            <w:tcW w:w="1506" w:type="dxa"/>
+            <w:tcBorders>
+              <w:top w:val="single" w:sz="4" w:space="0" w:color="auto"/>
+              <w:right w:val="single" w:sz="6" w:space="0" w:color="222222"/>
+            </w:tcBorders>
+            <w:shd w:val="clear" w:color="auto" w:fill="D9D9D9"/>
+            <w:vAlign w:val="center"/>
+          </w:tcPr>
+          <w:p>
+            <w:pPr>
+              <w:bidi/>
+              <w:rPr>
+                <w:rFonts w:ascii="Univers Next Arabic" w:hAnsi="Univers Next Arabic" w:cs="Univers Next Arabic"/>
+                <w:b/>
+                <w:color w:val="000000"/>
+                <w:sz w:val="19"/>
+                <w:szCs w:val="19"/>
+                <w:rtl/>
+              </w:rPr>
+            </w:pPr>
+            <w:r>
+              <w:rPr>
+                <w:rFonts w:ascii="Univers Next Arabic" w:hAnsi="Univers Next Arabic" w:cs="Univers Next Arabic"/>
+                <w:b/>
+                <w:color w:val="000000"/>
+                <w:sz w:val="19"/>
+                <w:szCs w:val="19"/>
+                <w:rtl/>
+              </w:rPr>
               <w:t>التوقيع</w:t>
             </w:r>
           </w:p>
         </w:tc>
         <w:tc>
           <w:tcPr>
-            <w:tcW w:w="2831" w:type="dxa"/>
+            <w:tcW w:w="3596" w:type="dxa"/>
             <w:tcBorders>
-              <w:top w:val="single" w:sz="6" w:space="0" w:color="000000" w:themeColor="text1"/>
+              <w:top w:val="single" w:sz="4" w:space="0" w:color="auto"/>
+              <w:left w:val="single" w:sz="6" w:space="0" w:color="222222"/>
+              <w:bottom w:val="single" w:sz="6" w:space="0" w:color="222222"/>
+              <w:right w:val="single" w:sz="4" w:space="0" w:color="auto"/>
+            </w:tcBorders>
+            <w:vAlign w:val="center"/>
+          </w:tcPr>
+          <w:p>
+            <w:pPr>
+              <w:bidi/>
+              <w:jc w:val="right"/>
+              <w:rPr>
+                <w:rFonts w:ascii="Univers Next Arabic" w:hAnsi="Univers Next Arabic" w:cs="Univers Next Arabic"/>
+                <w:sz w:val="19"/>
+                <w:szCs w:val="19"/>
+              </w:rPr>
+            </w:pPr>
+          </w:p>
+        </w:tc>
+        <w:tc>
+          <w:tcPr>
+            <w:tcW w:w="567" w:type="dxa"/>
+            <w:tcBorders>
+              <w:top w:val="nil"/>
+              <w:left w:val="single" w:sz="4" w:space="0" w:color="auto"/>
+              <w:bottom w:val="nil"/>
+              <w:right w:val="single" w:sz="4" w:space="0" w:color="auto"/>
+            </w:tcBorders>
+          </w:tcPr>
+          <w:p>
+            <w:pPr>
+              <w:bidi/>
+              <w:jc w:val="center"/>
+              <w:rPr>
+                <w:rFonts w:ascii="Univers Next Arabic" w:hAnsi="Univers Next Arabic" w:cs="Univers Next Arabic"/>
+                <w:b/>
+                <w:color w:val="000000"/>
+                <w:sz w:val="19"/>
+                <w:szCs w:val="19"/>
+                <w:rtl/>
+              </w:rPr>
+            </w:pPr>
+          </w:p>
+        </w:tc>
+        <w:tc>
+          <w:tcPr>
+            <w:tcW w:w="1506" w:type="dxa"/>
+            <w:tcBorders>
+              <w:top w:val="single" w:sz="4" w:space="0" w:color="auto"/>
+              <w:left w:val="single" w:sz="4" w:space="0" w:color="auto"/>
+              <w:bottom w:val="single" w:sz="6" w:space="0" w:color="222222"/>
+              <w:right w:val="single" w:sz="6" w:space="0" w:color="222222"/>
+            </w:tcBorders>
+            <w:shd w:val="clear" w:color="auto" w:fill="D9D9D9"/>
+            <w:vAlign w:val="center"/>
+          </w:tcPr>
+          <w:p>
+            <w:pPr>
+              <w:bidi/>
+              <w:jc w:val="center"/>
+              <w:rPr>
+                <w:rFonts w:ascii="Univers Next Arabic" w:hAnsi="Univers Next Arabic" w:cs="Univers Next Arabic"/>
+                <w:b/>
+                <w:color w:val="000000"/>
+                <w:sz w:val="19"/>
+                <w:szCs w:val="19"/>
+                <w:rtl/>
+              </w:rPr>
+            </w:pPr>
+            <w:r>
+              <w:rPr>
+                <w:rFonts w:ascii="Univers Next Arabic" w:hAnsi="Univers Next Arabic" w:cs="Univers Next Arabic"/>
+                <w:b/>
+                <w:color w:val="000000"/>
+                <w:sz w:val="19"/>
+                <w:szCs w:val="19"/>
+                <w:rtl/>
+              </w:rPr>
+              <w:t>التوقيع</w:t>
+            </w:r>
+          </w:p>
+        </w:tc>
+        <w:tc>
+          <w:tcPr>
+            <w:tcW w:w="3596" w:type="dxa"/>
+            <w:tcBorders>
+              <w:top w:val="single" w:sz="4" w:space="0" w:color="auto"/>
+              <w:left w:val="single" w:sz="6" w:space="0" w:color="222222"/>
             </w:tcBorders>
             <w:vAlign w:val="center"/>
           </w:tcPr>

</xml_diff>